<commit_message>
Finish a clean SRP models package
</commit_message>
<xml_diff>
--- a/docs/Plan.docx
+++ b/docs/Plan.docx
@@ -542,16 +542,7 @@
           <w:sz w:val="16"/>
           <w:szCs w:val="16"/>
         </w:rPr>
-        <w:t>│</w:t>
-      </w:r>
-      <w:r>
-        <w:rPr>
-          <w:b/>
-          <w:bCs/>
-          <w:sz w:val="16"/>
-          <w:szCs w:val="16"/>
-        </w:rPr>
-        <w:t>___ App/</w:t>
+        <w:t>│___ App/</w:t>
       </w:r>
       <w:r>
         <w:rPr>
@@ -781,31 +772,20 @@
         </w:rPr>
         <w:t xml:space="preserve"> tests/</w:t>
       </w:r>
-      <w:r>
-        <w:rPr>
-          <w:b/>
-          <w:bCs/>
-          <w:sz w:val="16"/>
-          <w:szCs w:val="16"/>
-        </w:rPr>
-        <w:t xml:space="preserve"> </w:t>
-      </w:r>
-    </w:p>
-    <w:p>
-      <w:pPr>
-        <w:rPr>
-          <w:b/>
-          <w:bCs/>
-          <w:sz w:val="16"/>
-          <w:szCs w:val="16"/>
-        </w:rPr>
-      </w:pPr>
-      <w:r>
-        <w:rPr>
-          <w:b/>
-          <w:bCs/>
-          <w:sz w:val="16"/>
-          <w:szCs w:val="16"/>
+    </w:p>
+    <w:p>
+      <w:pPr>
+        <w:rPr>
+          <w:b/>
+          <w:bCs/>
+          <w:sz w:val="16"/>
+          <w:szCs w:val="16"/>
+        </w:rPr>
+      </w:pPr>
+      <w:r>
+        <w:rPr>
+          <w:b/>
+          <w:bCs/>
         </w:rPr>
         <w:lastRenderedPageBreak/>
         <w:t>Over view at the design :</w:t>
@@ -823,6 +803,7 @@
         <w:rPr>
           <w:b/>
           <w:bCs/>
+          <w:noProof/>
           <w:sz w:val="16"/>
           <w:szCs w:val="16"/>
         </w:rPr>

</xml_diff>